<commit_message>
Implement Bulk OCR Dates UI Fixes
</commit_message>
<xml_diff>
--- a/public/template.docx
+++ b/public/template.docx
@@ -816,43 +816,12 @@
             <w:hideMark/>
           </w:tcPr>
           <w:p>
-            <w:pPr>
-              <w:overflowPunct/>
-              <w:autoSpaceDE/>
-              <w:autoSpaceDN/>
-              <w:adjustRightInd/>
-              <w:textAlignment w:val="auto"/>
-              <w:rPr>
-                <w:rFonts w:ascii="Arial" w:hAnsi="Arial" w:cs="Arial"/>
-                <w:lang w:val="en-MY"/>
-              </w:rPr>
-            </w:pPr>
-            <w:r>
-              <w:rPr>
-                <w:rFonts w:ascii="Arial" w:hAnsi="Arial" w:cs="Arial"/>
-                <w:lang w:val="en-MY"/>
-              </w:rPr>
+            <w:r>
               <w:t>Trina Solar TSM NEG19.20 620W</w:t>
-            </w:r>
-          </w:p>
-          <w:p>
-            <w:pPr>
-              <w:pStyle w:val="ListParagraph"/>
-              <w:numPr>
-                <w:ilvl w:val="0"/>
-                <w:numId w:val="24"/>
-              </w:numPr>
-              <w:overflowPunct/>
-              <w:autoSpaceDE/>
-              <w:autoSpaceDN/>
-              <w:adjustRightInd/>
-              <w:textAlignment w:val="auto"/>
-              <w:rPr>
-                <w:rFonts w:ascii="Arial" w:hAnsi="Arial" w:cs="Arial"/>
-                <w:sz w:val="18"/>
-                <w:szCs w:val="18"/>
-              </w:rPr>
-            </w:pPr>
+              <w:br/>
+              <w:br/>
+              <w:t>Serials: {serialNumbers}</w:t>
+            </w:r>
           </w:p>
         </w:tc>
         <w:tc>

</xml_diff>